<commit_message>
Update models with expanded training data and fix stale accuracy numbers
</commit_message>
<xml_diff>
--- a/reports/Ticket_Triage_Project_Report.docx
+++ b/reports/Ticket_Triage_Project_Report.docx
@@ -572,7 +572,7 @@
                 <w:b w:val="false"/>
                 <w:bCs w:val="false"/>
               </w:rPr>
-              <w:t xml:space="preserve">95.2%</w:t>
+              <w:t xml:space="preserve">95.5%</w:t>
             </w:r>
           </w:p>
         </w:tc>
@@ -586,7 +586,7 @@
                 <w:b w:val="false"/>
                 <w:bCs w:val="false"/>
               </w:rPr>
-              <w:t xml:space="preserve">0.953</w:t>
+              <w:t xml:space="preserve">0.955</w:t>
             </w:r>
           </w:p>
         </w:tc>
@@ -630,7 +630,7 @@
                 <w:b w:val="false"/>
                 <w:bCs w:val="false"/>
               </w:rPr>
-              <w:t xml:space="preserve">93.9%</w:t>
+              <w:t xml:space="preserve">94.8%</w:t>
             </w:r>
           </w:p>
         </w:tc>
@@ -644,7 +644,7 @@
                 <w:b w:val="false"/>
                 <w:bCs w:val="false"/>
               </w:rPr>
-              <w:t xml:space="preserve">0.939</w:t>
+              <w:t xml:space="preserve">0.949</w:t>
             </w:r>
           </w:p>
         </w:tc>
@@ -708,7 +708,7 @@
         <w:spacing w:after="160"/>
       </w:pPr>
       <w:r>
-        <w:t xml:space="preserve">Manual testing surfaced a specific, reproducible gap: the ticket "my account got hacked I think, please help asap" was classified with only medium urgency, despite "asap" clearly signalling urgency to a human reader. The training data's high-urgency examples used phrases like "URGENT" and "immediately" but never "asap", so the model had no basis to associate it with urgency. This illustrates a general limitation of keyword-driven text classifiers: they are only as good as the vocabulary present in their training examples, and will silently under-perform on phrasing they have not seen. A production system would need either a larger, more linguistically diverse training set or a switch to sentence embeddings, which capture meaning rather than exact wording.</w:t>
+        <w:t xml:space="preserve">Manual testing surfaced a specific, reproducible gap: the ticket "URGENT our whole team is blocked please escalate" was classified with only 46% category confidence and an incorrect category guess. Unlike most tickets, it contains no topic-specific words at all (no mention of billing, a technical issue, or an account) — only urgency language. This illustrates a general limitation of keyword-driven text classifiers: category prediction fundamentally requires some topic vocabulary to work from, and a ticket that omits it is genuinely ambiguous, to a human reader as well as to the model. The system correctly flagged this case for human review rather than guessing confidently and wrongly.</w:t>
       </w:r>
     </w:p>
     <w:p>
@@ -717,7 +717,32 @@
         <w:spacing w:after="140" w:before="280"/>
       </w:pPr>
       <w:r>
-        <w:t xml:space="preserve">7. Conclusion and Next Steps</w:t>
+        <w:t xml:space="preserve">7. Iteration: Expanding Training Phrase Variety</w:t>
+      </w:r>
+    </w:p>
+    <w:p>
+      <w:pPr>
+        <w:spacing w:after="160"/>
+      </w:pPr>
+      <w:r>
+        <w:t xml:space="preserve">An earlier version of the model showed a related but fixable issue: some clearly-categorizable tickets (e.g. "My payment failed and I need this fixed immediately") received unexpectedly low confidence, because the training data contained only 4 phrase variations per category. The model had too narrow a vocabulary to recognize the same intent expressed in slightly different words.</w:t>
+      </w:r>
+    </w:p>
+    <w:p>
+      <w:pPr>
+        <w:spacing w:after="160"/>
+      </w:pPr>
+      <w:r>
+        <w:t xml:space="preserve">The training templates were expanded from 4 to 10 phrases per category, covering a wider range of real phrasing for the same underlying issues. After retraining, category accuracy improved from 95.2% to 95.5% and urgency accuracy from 93.9% to 94.8%. More importantly, confidence on the specific ticket above rose from 56% (flagged for review) to 80% (confidently auto-routed) — the kind of targeted improvement that a broad accuracy number alone would not reveal.</w:t>
+      </w:r>
+    </w:p>
+    <w:p>
+      <w:pPr>
+        <w:pStyle w:val="Heading1"/>
+        <w:spacing w:after="140" w:before="280"/>
+      </w:pPr>
+      <w:r>
+        <w:t xml:space="preserve">8. Conclusion and Next Steps</w:t>
       </w:r>
     </w:p>
     <w:p>

</xml_diff>

<commit_message>
Add personal reflection section to project report
</commit_message>
<xml_diff>
--- a/reports/Ticket_Triage_Project_Report.docx
+++ b/reports/Ticket_Triage_Project_Report.docx
@@ -742,7 +742,40 @@
         <w:spacing w:after="140" w:before="280"/>
       </w:pPr>
       <w:r>
-        <w:t xml:space="preserve">8. Conclusion and Next Steps</w:t>
+        <w:t xml:space="preserve">9. Personal Reflection</w:t>
+      </w:r>
+    </w:p>
+    <w:p>
+      <w:pPr>
+        <w:spacing w:after="160"/>
+      </w:pPr>
+      <w:r>
+        <w:t xml:space="preserve">Three moments stood out most while building this project. The first was seeing the first trained models score a perfect 100% accuracy and initially feeling pleased, before realizing that a perfect score on a classification task is a warning sign, not an achievement — it meant the test data was not actually testing anything. Tracing that back to a labelling bug in the ambiguous-ticket generator, and fixing it so accuracy dropped to a defensible 93-95%, was the point where this stopped feeling like a tutorial exercise and started feeling like real evaluation work.</w:t>
+      </w:r>
+    </w:p>
+    <w:p>
+      <w:pPr>
+        <w:spacing w:after="160"/>
+      </w:pPr>
+      <w:r>
+        <w:t xml:space="preserve">The second was testing the live tool with a ticket containing the word "asap" and watching it get classified as only medium urgency, despite being obviously urgent to a human reader. It was a concrete, reproducible example of a model being limited by the exact vocabulary it was trained on, rather than an abstract textbook point.</w:t>
+      </w:r>
+    </w:p>
+    <w:p>
+      <w:pPr>
+        <w:spacing w:after="160"/>
+      </w:pPr>
+      <w:r>
+        <w:t xml:space="preserve">The third was adding the "Check Another Ticket" button to the dashboard after wanting a smoother way to test multiple tickets without retyping into the same box — and then finding that the first implementation of it broke with a Streamlit session-state error. Debugging that, and fixing it with a changing widget key instead of a direct value overwrite, was a small but genuine lesson in how a UI framework's state management works under the hood.</w:t>
+      </w:r>
+    </w:p>
+    <w:p>
+      <w:pPr>
+        <w:pStyle w:val="Heading1"/>
+        <w:spacing w:after="140" w:before="280"/>
+      </w:pPr>
+      <w:r>
+        <w:t xml:space="preserve">10. Conclusion and Next Steps</w:t>
       </w:r>
     </w:p>
     <w:p>

</xml_diff>